<commit_message>
Fix duplicates in Meet a Maker source book
The 13 flagship picks were printed twice (flagship table + category
table). Replace the flagship full table with a compact one-line index
that points to the (now single) detailed entries in the category tables.
56 unique businesses, no duplicate rows.

https://claude.ai/code/session_01MZCcvfRxTVSc6PAak7p1Nw
</commit_message>
<xml_diff>
--- a/Meet_a_Maker_Source_Book.docx
+++ b/Meet_a_Maker_Source_Book.docx
@@ -200,1404 +200,164 @@
           <w:i w:val="0"/>
           <w:sz w:val="20"/>
         </w:rPr>
-        <w:t>The cleanest origin stories with the best human hooks and high confidence — ideal for the first run of features and the monthly long-form profile.</w:t>
+        <w:t>The cleanest origin stories with the best human hooks and high confidence — ideal for the first run of features and the monthly long-form profile. Each is marked ★ in its category table below (full detail there); this is just the shortlist.</w:t>
       </w:r>
     </w:p>
-    <w:tbl>
-      <w:tblPr>
-        <w:tblStyle w:val="TableGrid"/>
-        <w:tblW w:type="auto" w:w="0"/>
-        <w:jc w:val="center"/>
-        <w:tblLook w:firstColumn="1" w:firstRow="1" w:lastColumn="0" w:lastRow="0" w:noHBand="0" w:noVBand="1" w:val="04A0"/>
-      </w:tblPr>
-      <w:tblGrid>
-        <w:gridCol w:w="2822"/>
-        <w:gridCol w:w="2822"/>
-        <w:gridCol w:w="2822"/>
-        <w:gridCol w:w="2822"/>
-        <w:gridCol w:w="2822"/>
-      </w:tblGrid>
-      <w:tr>
-        <w:tc>
-          <w:tcPr>
-            <w:tcW w:type="dxa" w:w="2160"/>
-            <w:shd w:val="clear" w:color="auto" w:fill="1B3A4B"/>
-          </w:tcPr>
-          <w:p>
-            <w:pPr>
-              <w:jc w:val="left"/>
-            </w:pPr>
-            <w:r/>
-            <w:r>
-              <w:rPr>
-                <w:b/>
-                <w:color w:val="FFFFFF"/>
-                <w:sz w:val="18"/>
-              </w:rPr>
-              <w:t>Business</w:t>
-            </w:r>
-          </w:p>
-        </w:tc>
-        <w:tc>
-          <w:tcPr>
-            <w:tcW w:type="dxa" w:w="2880"/>
-            <w:shd w:val="clear" w:color="auto" w:fill="1B3A4B"/>
-          </w:tcPr>
-          <w:p>
-            <w:pPr>
-              <w:jc w:val="left"/>
-            </w:pPr>
-            <w:r/>
-            <w:r>
-              <w:rPr>
-                <w:b/>
-                <w:color w:val="FFFFFF"/>
-                <w:sz w:val="18"/>
-              </w:rPr>
-              <w:t>Person &amp; role</w:t>
-            </w:r>
-          </w:p>
-        </w:tc>
-        <w:tc>
-          <w:tcPr>
-            <w:tcW w:type="dxa" w:w="1656"/>
-            <w:shd w:val="clear" w:color="auto" w:fill="1B3A4B"/>
-          </w:tcPr>
-          <w:p>
-            <w:pPr>
-              <w:jc w:val="left"/>
-            </w:pPr>
-            <w:r/>
-            <w:r>
-              <w:rPr>
-                <w:b/>
-                <w:color w:val="FFFFFF"/>
-                <w:sz w:val="18"/>
-              </w:rPr>
-              <w:t>Area</w:t>
-            </w:r>
-          </w:p>
-        </w:tc>
-        <w:tc>
-          <w:tcPr>
-            <w:tcW w:type="dxa" w:w="7200"/>
-            <w:shd w:val="clear" w:color="auto" w:fill="1B3A4B"/>
-          </w:tcPr>
-          <w:p>
-            <w:pPr>
-              <w:jc w:val="left"/>
-            </w:pPr>
-            <w:r/>
-            <w:r>
-              <w:rPr>
-                <w:b/>
-                <w:color w:val="FFFFFF"/>
-                <w:sz w:val="18"/>
-              </w:rPr>
-              <w:t>Story angle (the human hook)</w:t>
-            </w:r>
-          </w:p>
-        </w:tc>
-        <w:tc>
-          <w:tcPr>
-            <w:tcW w:type="dxa" w:w="792"/>
-            <w:shd w:val="clear" w:color="auto" w:fill="1B3A4B"/>
-          </w:tcPr>
-          <w:p>
-            <w:pPr>
-              <w:jc w:val="center"/>
-            </w:pPr>
-            <w:r/>
-            <w:r>
-              <w:rPr>
-                <w:b/>
-                <w:color w:val="FFFFFF"/>
-                <w:sz w:val="18"/>
-              </w:rPr>
-              <w:t>Conf.</w:t>
-            </w:r>
-          </w:p>
-        </w:tc>
-      </w:tr>
-      <w:tr>
-        <w:tc>
-          <w:tcPr>
-            <w:tcW w:type="dxa" w:w="2160"/>
-            <w:shd w:val="clear" w:color="auto" w:fill="E9C46A"/>
-          </w:tcPr>
-          <w:p>
-            <w:pPr>
-              <w:jc w:val="left"/>
-            </w:pPr>
-            <w:r/>
-            <w:r>
-              <w:rPr>
-                <w:b/>
-                <w:color w:val="1B3A4B"/>
-                <w:sz w:val="17"/>
-              </w:rPr>
-              <w:t>Calliope  ★</w:t>
-            </w:r>
-          </w:p>
-        </w:tc>
-        <w:tc>
-          <w:tcPr>
-            <w:tcW w:type="dxa" w:w="2880"/>
-            <w:shd w:val="clear" w:color="auto" w:fill="E9C46A"/>
-          </w:tcPr>
-          <w:p>
-            <w:pPr>
-              <w:jc w:val="left"/>
-            </w:pPr>
-            <w:r/>
-            <w:r>
-              <w:rPr>
-                <w:b w:val="0"/>
-                <w:sz w:val="17"/>
-              </w:rPr>
-              <w:t>Khaled Albanna — chef &amp; co-owner</w:t>
-            </w:r>
-          </w:p>
-        </w:tc>
-        <w:tc>
-          <w:tcPr>
-            <w:tcW w:type="dxa" w:w="1656"/>
-            <w:shd w:val="clear" w:color="auto" w:fill="E9C46A"/>
-          </w:tcPr>
-          <w:p>
-            <w:pPr>
-              <w:jc w:val="left"/>
-            </w:pPr>
-            <w:r/>
-            <w:r>
-              <w:rPr>
-                <w:b w:val="0"/>
-                <w:sz w:val="17"/>
-              </w:rPr>
-              <w:t>Downtown/Southside</w:t>
-            </w:r>
-          </w:p>
-        </w:tc>
-        <w:tc>
-          <w:tcPr>
-            <w:tcW w:type="dxa" w:w="7200"/>
-            <w:shd w:val="clear" w:color="auto" w:fill="E9C46A"/>
-          </w:tcPr>
-          <w:p>
-            <w:pPr>
-              <w:jc w:val="left"/>
-            </w:pPr>
-            <w:r/>
-            <w:r>
-              <w:rPr>
-                <w:b w:val="0"/>
-                <w:sz w:val="17"/>
-              </w:rPr>
-              <w:t>Amman-born, came to UTC for civil engineering, switched to cooking; modern Levantine-meets-South named among the NYT's top 50 U.S. restaurants.</w:t>
-            </w:r>
-          </w:p>
-        </w:tc>
-        <w:tc>
-          <w:tcPr>
-            <w:tcW w:type="dxa" w:w="792"/>
-            <w:shd w:val="clear" w:color="auto" w:fill="E9C46A"/>
-          </w:tcPr>
-          <w:p>
-            <w:pPr>
-              <w:jc w:val="center"/>
-            </w:pPr>
-            <w:r/>
-            <w:r>
-              <w:rPr>
-                <w:b w:val="0"/>
-                <w:sz w:val="17"/>
-              </w:rPr>
-              <w:t>High</w:t>
-            </w:r>
-          </w:p>
-        </w:tc>
-      </w:tr>
-      <w:tr>
-        <w:tc>
-          <w:tcPr>
-            <w:tcW w:type="dxa" w:w="2160"/>
-            <w:shd w:val="clear" w:color="auto" w:fill="E9C46A"/>
-          </w:tcPr>
-          <w:p>
-            <w:pPr>
-              <w:jc w:val="left"/>
-            </w:pPr>
-            <w:r/>
-            <w:r>
-              <w:rPr>
-                <w:b/>
-                <w:color w:val="1B3A4B"/>
-                <w:sz w:val="17"/>
-              </w:rPr>
-              <w:t>Alleia  ★</w:t>
-            </w:r>
-          </w:p>
-        </w:tc>
-        <w:tc>
-          <w:tcPr>
-            <w:tcW w:type="dxa" w:w="2880"/>
-            <w:shd w:val="clear" w:color="auto" w:fill="E9C46A"/>
-          </w:tcPr>
-          <w:p>
-            <w:pPr>
-              <w:jc w:val="left"/>
-            </w:pPr>
-            <w:r/>
-            <w:r>
-              <w:rPr>
-                <w:b w:val="0"/>
-                <w:sz w:val="17"/>
-              </w:rPr>
-              <w:t>Daniel Lindley — chef-owner</w:t>
-            </w:r>
-          </w:p>
-        </w:tc>
-        <w:tc>
-          <w:tcPr>
-            <w:tcW w:type="dxa" w:w="1656"/>
-            <w:shd w:val="clear" w:color="auto" w:fill="E9C46A"/>
-          </w:tcPr>
-          <w:p>
-            <w:pPr>
-              <w:jc w:val="left"/>
-            </w:pPr>
-            <w:r/>
-            <w:r>
-              <w:rPr>
-                <w:b w:val="0"/>
-                <w:sz w:val="17"/>
-              </w:rPr>
-              <w:t>Southside (Main St)</w:t>
-            </w:r>
-          </w:p>
-        </w:tc>
-        <w:tc>
-          <w:tcPr>
-            <w:tcW w:type="dxa" w:w="7200"/>
-            <w:shd w:val="clear" w:color="auto" w:fill="E9C46A"/>
-          </w:tcPr>
-          <w:p>
-            <w:pPr>
-              <w:jc w:val="left"/>
-            </w:pPr>
-            <w:r/>
-            <w:r>
-              <w:rPr>
-                <w:b w:val="0"/>
-                <w:sz w:val="17"/>
-              </w:rPr>
-              <w:t>Native Chattanoogan who started at 17 as a dishwasher, cooked around the world, opened Alleia in 2009; multiple James Beard nominee.</w:t>
-            </w:r>
-          </w:p>
-        </w:tc>
-        <w:tc>
-          <w:tcPr>
-            <w:tcW w:type="dxa" w:w="792"/>
-            <w:shd w:val="clear" w:color="auto" w:fill="E9C46A"/>
-          </w:tcPr>
-          <w:p>
-            <w:pPr>
-              <w:jc w:val="center"/>
-            </w:pPr>
-            <w:r/>
-            <w:r>
-              <w:rPr>
-                <w:b w:val="0"/>
-                <w:sz w:val="17"/>
-              </w:rPr>
-              <w:t>High</w:t>
-            </w:r>
-          </w:p>
-        </w:tc>
-      </w:tr>
-      <w:tr>
-        <w:tc>
-          <w:tcPr>
-            <w:tcW w:type="dxa" w:w="2160"/>
-            <w:shd w:val="clear" w:color="auto" w:fill="E9C46A"/>
-          </w:tcPr>
-          <w:p>
-            <w:pPr>
-              <w:jc w:val="left"/>
-            </w:pPr>
-            <w:r/>
-            <w:r>
-              <w:rPr>
-                <w:b/>
-                <w:color w:val="1B3A4B"/>
-                <w:sz w:val="17"/>
-              </w:rPr>
-              <w:t>Chattanooga Whiskey  ★</w:t>
-            </w:r>
-          </w:p>
-        </w:tc>
-        <w:tc>
-          <w:tcPr>
-            <w:tcW w:type="dxa" w:w="2880"/>
-            <w:shd w:val="clear" w:color="auto" w:fill="E9C46A"/>
-          </w:tcPr>
-          <w:p>
-            <w:pPr>
-              <w:jc w:val="left"/>
-            </w:pPr>
-            <w:r/>
-            <w:r>
-              <w:rPr>
-                <w:b w:val="0"/>
-                <w:sz w:val="17"/>
-              </w:rPr>
-              <w:t>Tim Piersant — co-founder/CEO (w/ Joe Ledbetter)</w:t>
-            </w:r>
-          </w:p>
-        </w:tc>
-        <w:tc>
-          <w:tcPr>
-            <w:tcW w:type="dxa" w:w="1656"/>
-            <w:shd w:val="clear" w:color="auto" w:fill="E9C46A"/>
-          </w:tcPr>
-          <w:p>
-            <w:pPr>
-              <w:jc w:val="left"/>
-            </w:pPr>
-            <w:r/>
-            <w:r>
-              <w:rPr>
-                <w:b w:val="0"/>
-                <w:sz w:val="17"/>
-              </w:rPr>
-              <w:t>Downtown</w:t>
-            </w:r>
-          </w:p>
-        </w:tc>
-        <w:tc>
-          <w:tcPr>
-            <w:tcW w:type="dxa" w:w="7200"/>
-            <w:shd w:val="clear" w:color="auto" w:fill="E9C46A"/>
-          </w:tcPr>
-          <w:p>
-            <w:pPr>
-              <w:jc w:val="left"/>
-            </w:pPr>
-            <w:r/>
-            <w:r>
-              <w:rPr>
-                <w:b w:val="0"/>
-                <w:sz w:val="17"/>
-              </w:rPr>
-              <w:t>Led the grassroots 'Vote Whiskey' campaign that overturned a century-old local distilling ban; built the first legal Chattanooga distillery in ~100 years. 'Whiskey to the People.'</w:t>
-            </w:r>
-          </w:p>
-        </w:tc>
-        <w:tc>
-          <w:tcPr>
-            <w:tcW w:type="dxa" w:w="792"/>
-            <w:shd w:val="clear" w:color="auto" w:fill="E9C46A"/>
-          </w:tcPr>
-          <w:p>
-            <w:pPr>
-              <w:jc w:val="center"/>
-            </w:pPr>
-            <w:r/>
-            <w:r>
-              <w:rPr>
-                <w:b w:val="0"/>
-                <w:sz w:val="17"/>
-              </w:rPr>
-              <w:t>High</w:t>
-            </w:r>
-          </w:p>
-        </w:tc>
-      </w:tr>
-      <w:tr>
-        <w:tc>
-          <w:tcPr>
-            <w:tcW w:type="dxa" w:w="2160"/>
-            <w:shd w:val="clear" w:color="auto" w:fill="E9C46A"/>
-          </w:tcPr>
-          <w:p>
-            <w:pPr>
-              <w:jc w:val="left"/>
-            </w:pPr>
-            <w:r/>
-            <w:r>
-              <w:rPr>
-                <w:b/>
-                <w:color w:val="1B3A4B"/>
-                <w:sz w:val="17"/>
-              </w:rPr>
-              <w:t>Mad Priest Coffee  ★</w:t>
-            </w:r>
-          </w:p>
-        </w:tc>
-        <w:tc>
-          <w:tcPr>
-            <w:tcW w:type="dxa" w:w="2880"/>
-            <w:shd w:val="clear" w:color="auto" w:fill="E9C46A"/>
-          </w:tcPr>
-          <w:p>
-            <w:pPr>
-              <w:jc w:val="left"/>
-            </w:pPr>
-            <w:r/>
-            <w:r>
-              <w:rPr>
-                <w:b w:val="0"/>
-                <w:sz w:val="17"/>
-              </w:rPr>
-              <w:t>Michael &amp; Cherita Rice — co-founders</w:t>
-            </w:r>
-          </w:p>
-        </w:tc>
-        <w:tc>
-          <w:tcPr>
-            <w:tcW w:type="dxa" w:w="1656"/>
-            <w:shd w:val="clear" w:color="auto" w:fill="E9C46A"/>
-          </w:tcPr>
-          <w:p>
-            <w:pPr>
-              <w:jc w:val="left"/>
-            </w:pPr>
-            <w:r/>
-            <w:r>
-              <w:rPr>
-                <w:b w:val="0"/>
-                <w:sz w:val="17"/>
-              </w:rPr>
-              <w:t>Downtown (McCallie)</w:t>
-            </w:r>
-          </w:p>
-        </w:tc>
-        <w:tc>
-          <w:tcPr>
-            <w:tcW w:type="dxa" w:w="7200"/>
-            <w:shd w:val="clear" w:color="auto" w:fill="E9C46A"/>
-          </w:tcPr>
-          <w:p>
-            <w:pPr>
-              <w:jc w:val="left"/>
-            </w:pPr>
-            <w:r/>
-            <w:r>
-              <w:rPr>
-                <w:b w:val="0"/>
-                <w:sz w:val="17"/>
-              </w:rPr>
-              <w:t>Founded 2015 after meeting displaced refugees abroad; mission to 'champion the displaced' — a co-owner, Tarig Idris, was a Sudanese refugee and their first employee.</w:t>
-            </w:r>
-          </w:p>
-        </w:tc>
-        <w:tc>
-          <w:tcPr>
-            <w:tcW w:type="dxa" w:w="792"/>
-            <w:shd w:val="clear" w:color="auto" w:fill="E9C46A"/>
-          </w:tcPr>
-          <w:p>
-            <w:pPr>
-              <w:jc w:val="center"/>
-            </w:pPr>
-            <w:r/>
-            <w:r>
-              <w:rPr>
-                <w:b w:val="0"/>
-                <w:sz w:val="17"/>
-              </w:rPr>
-              <w:t>High</w:t>
-            </w:r>
-          </w:p>
-        </w:tc>
-      </w:tr>
-      <w:tr>
-        <w:tc>
-          <w:tcPr>
-            <w:tcW w:type="dxa" w:w="2160"/>
-            <w:shd w:val="clear" w:color="auto" w:fill="E9C46A"/>
-          </w:tcPr>
-          <w:p>
-            <w:pPr>
-              <w:jc w:val="left"/>
-            </w:pPr>
-            <w:r/>
-            <w:r>
-              <w:rPr>
-                <w:b/>
-                <w:color w:val="1B3A4B"/>
-                <w:sz w:val="17"/>
-              </w:rPr>
-              <w:t>Niedlov's Bakery &amp; Café  ★</w:t>
-            </w:r>
-          </w:p>
-        </w:tc>
-        <w:tc>
-          <w:tcPr>
-            <w:tcW w:type="dxa" w:w="2880"/>
-            <w:shd w:val="clear" w:color="auto" w:fill="E9C46A"/>
-          </w:tcPr>
-          <w:p>
-            <w:pPr>
-              <w:jc w:val="left"/>
-            </w:pPr>
-            <w:r/>
-            <w:r>
-              <w:rPr>
-                <w:b w:val="0"/>
-                <w:sz w:val="17"/>
-              </w:rPr>
-              <w:t>Erik &amp; Lauren Zilen — owners</w:t>
-            </w:r>
-          </w:p>
-        </w:tc>
-        <w:tc>
-          <w:tcPr>
-            <w:tcW w:type="dxa" w:w="1656"/>
-            <w:shd w:val="clear" w:color="auto" w:fill="E9C46A"/>
-          </w:tcPr>
-          <w:p>
-            <w:pPr>
-              <w:jc w:val="left"/>
-            </w:pPr>
-            <w:r/>
-            <w:r>
-              <w:rPr>
-                <w:b w:val="0"/>
-                <w:sz w:val="17"/>
-              </w:rPr>
-              <w:t>Southside (E. Main)</w:t>
-            </w:r>
-          </w:p>
-        </w:tc>
-        <w:tc>
-          <w:tcPr>
-            <w:tcW w:type="dxa" w:w="7200"/>
-            <w:shd w:val="clear" w:color="auto" w:fill="E9C46A"/>
-          </w:tcPr>
-          <w:p>
-            <w:pPr>
-              <w:jc w:val="left"/>
-            </w:pPr>
-            <w:r/>
-            <w:r>
-              <w:rPr>
-                <w:b w:val="0"/>
-                <w:sz w:val="17"/>
-              </w:rPr>
-              <w:t>The city's cornerstone sourdough bakery; the Zilens hire people coming out of prison, compost ~1,300 lbs/month, and give away thousands of loaves.</w:t>
-            </w:r>
-          </w:p>
-        </w:tc>
-        <w:tc>
-          <w:tcPr>
-            <w:tcW w:type="dxa" w:w="792"/>
-            <w:shd w:val="clear" w:color="auto" w:fill="E9C46A"/>
-          </w:tcPr>
-          <w:p>
-            <w:pPr>
-              <w:jc w:val="center"/>
-            </w:pPr>
-            <w:r/>
-            <w:r>
-              <w:rPr>
-                <w:b w:val="0"/>
-                <w:sz w:val="17"/>
-              </w:rPr>
-              <w:t>High</w:t>
-            </w:r>
-          </w:p>
-        </w:tc>
-      </w:tr>
-      <w:tr>
-        <w:tc>
-          <w:tcPr>
-            <w:tcW w:type="dxa" w:w="2160"/>
-            <w:shd w:val="clear" w:color="auto" w:fill="E9C46A"/>
-          </w:tcPr>
-          <w:p>
-            <w:pPr>
-              <w:jc w:val="left"/>
-            </w:pPr>
-            <w:r/>
-            <w:r>
-              <w:rPr>
-                <w:b/>
-                <w:color w:val="1B3A4B"/>
-                <w:sz w:val="17"/>
-              </w:rPr>
-              <w:t>Cocoa Asante  ★</w:t>
-            </w:r>
-          </w:p>
-        </w:tc>
-        <w:tc>
-          <w:tcPr>
-            <w:tcW w:type="dxa" w:w="2880"/>
-            <w:shd w:val="clear" w:color="auto" w:fill="E9C46A"/>
-          </w:tcPr>
-          <w:p>
-            <w:pPr>
-              <w:jc w:val="left"/>
-            </w:pPr>
-            <w:r/>
-            <w:r>
-              <w:rPr>
-                <w:b w:val="0"/>
-                <w:sz w:val="17"/>
-              </w:rPr>
-              <w:t>Ella Livingston — founder</w:t>
-            </w:r>
-          </w:p>
-        </w:tc>
-        <w:tc>
-          <w:tcPr>
-            <w:tcW w:type="dxa" w:w="1656"/>
-            <w:shd w:val="clear" w:color="auto" w:fill="E9C46A"/>
-          </w:tcPr>
-          <w:p>
-            <w:pPr>
-              <w:jc w:val="left"/>
-            </w:pPr>
-            <w:r/>
-            <w:r>
-              <w:rPr>
-                <w:b w:val="0"/>
-                <w:sz w:val="17"/>
-              </w:rPr>
-              <w:t>Chattanooga</w:t>
-            </w:r>
-          </w:p>
-        </w:tc>
-        <w:tc>
-          <w:tcPr>
-            <w:tcW w:type="dxa" w:w="7200"/>
-            <w:shd w:val="clear" w:color="auto" w:fill="E9C46A"/>
-          </w:tcPr>
-          <w:p>
-            <w:pPr>
-              <w:jc w:val="left"/>
-            </w:pPr>
-            <w:r/>
-            <w:r>
-              <w:rPr>
-                <w:b w:val="0"/>
-                <w:sz w:val="17"/>
-              </w:rPr>
-              <w:t>Self-taught chocolatier and former math teacher; a viral 2018 TikTok launched her bonbons — now working toward sourcing cacao from her family's farm in Ghana.</w:t>
-            </w:r>
-          </w:p>
-        </w:tc>
-        <w:tc>
-          <w:tcPr>
-            <w:tcW w:type="dxa" w:w="792"/>
-            <w:shd w:val="clear" w:color="auto" w:fill="E9C46A"/>
-          </w:tcPr>
-          <w:p>
-            <w:pPr>
-              <w:jc w:val="center"/>
-            </w:pPr>
-            <w:r/>
-            <w:r>
-              <w:rPr>
-                <w:b w:val="0"/>
-                <w:sz w:val="17"/>
-              </w:rPr>
-              <w:t>High</w:t>
-            </w:r>
-          </w:p>
-        </w:tc>
-      </w:tr>
-      <w:tr>
-        <w:tc>
-          <w:tcPr>
-            <w:tcW w:type="dxa" w:w="2160"/>
-            <w:shd w:val="clear" w:color="auto" w:fill="E9C46A"/>
-          </w:tcPr>
-          <w:p>
-            <w:pPr>
-              <w:jc w:val="left"/>
-            </w:pPr>
-            <w:r/>
-            <w:r>
-              <w:rPr>
-                <w:b/>
-                <w:color w:val="1B3A4B"/>
-                <w:sz w:val="17"/>
-              </w:rPr>
-              <w:t>Embellish Collection  ★</w:t>
-            </w:r>
-          </w:p>
-        </w:tc>
-        <w:tc>
-          <w:tcPr>
-            <w:tcW w:type="dxa" w:w="2880"/>
-            <w:shd w:val="clear" w:color="auto" w:fill="E9C46A"/>
-          </w:tcPr>
-          <w:p>
-            <w:pPr>
-              <w:jc w:val="left"/>
-            </w:pPr>
-            <w:r/>
-            <w:r>
-              <w:rPr>
-                <w:b w:val="0"/>
-                <w:sz w:val="17"/>
-              </w:rPr>
-              <w:t>Ann Trammell Newton — owner</w:t>
-            </w:r>
-          </w:p>
-        </w:tc>
-        <w:tc>
-          <w:tcPr>
-            <w:tcW w:type="dxa" w:w="1656"/>
-            <w:shd w:val="clear" w:color="auto" w:fill="E9C46A"/>
-          </w:tcPr>
-          <w:p>
-            <w:pPr>
-              <w:jc w:val="left"/>
-            </w:pPr>
-            <w:r/>
-            <w:r>
-              <w:rPr>
-                <w:b w:val="0"/>
-                <w:sz w:val="17"/>
-              </w:rPr>
-              <w:t>Downtown (Warehouse Row)</w:t>
-            </w:r>
-          </w:p>
-        </w:tc>
-        <w:tc>
-          <w:tcPr>
-            <w:tcW w:type="dxa" w:w="7200"/>
-            <w:shd w:val="clear" w:color="auto" w:fill="E9C46A"/>
-          </w:tcPr>
-          <w:p>
-            <w:pPr>
-              <w:jc w:val="left"/>
-            </w:pPr>
-            <w:r/>
-            <w:r>
-              <w:rPr>
-                <w:b w:val="0"/>
-                <w:sz w:val="17"/>
-              </w:rPr>
-              <w:t>A longtime customer who'd worked in NYC with von Furstenberg, de la Renta and Vince Camuto bought her favorite Chattanooga boutique in 2021 — a full-circle clothing story.</w:t>
-            </w:r>
-          </w:p>
-        </w:tc>
-        <w:tc>
-          <w:tcPr>
-            <w:tcW w:type="dxa" w:w="792"/>
-            <w:shd w:val="clear" w:color="auto" w:fill="E9C46A"/>
-          </w:tcPr>
-          <w:p>
-            <w:pPr>
-              <w:jc w:val="center"/>
-            </w:pPr>
-            <w:r/>
-            <w:r>
-              <w:rPr>
-                <w:b w:val="0"/>
-                <w:sz w:val="17"/>
-              </w:rPr>
-              <w:t>High</w:t>
-            </w:r>
-          </w:p>
-        </w:tc>
-      </w:tr>
-      <w:tr>
-        <w:tc>
-          <w:tcPr>
-            <w:tcW w:type="dxa" w:w="2160"/>
-            <w:shd w:val="clear" w:color="auto" w:fill="E9C46A"/>
-          </w:tcPr>
-          <w:p>
-            <w:pPr>
-              <w:jc w:val="left"/>
-            </w:pPr>
-            <w:r/>
-            <w:r>
-              <w:rPr>
-                <w:b/>
-                <w:color w:val="1B3A4B"/>
-                <w:sz w:val="17"/>
-              </w:rPr>
-              <w:t>Locals Only Gifts &amp; Goods  ★</w:t>
-            </w:r>
-          </w:p>
-        </w:tc>
-        <w:tc>
-          <w:tcPr>
-            <w:tcW w:type="dxa" w:w="2880"/>
-            <w:shd w:val="clear" w:color="auto" w:fill="E9C46A"/>
-          </w:tcPr>
-          <w:p>
-            <w:pPr>
-              <w:jc w:val="left"/>
-            </w:pPr>
-            <w:r/>
-            <w:r>
-              <w:rPr>
-                <w:b w:val="0"/>
-                <w:sz w:val="17"/>
-              </w:rPr>
-              <w:t>Danielle Landrum — founder (w/ Eric)</w:t>
-            </w:r>
-          </w:p>
-        </w:tc>
-        <w:tc>
-          <w:tcPr>
-            <w:tcW w:type="dxa" w:w="1656"/>
-            <w:shd w:val="clear" w:color="auto" w:fill="E9C46A"/>
-          </w:tcPr>
-          <w:p>
-            <w:pPr>
-              <w:jc w:val="left"/>
-            </w:pPr>
-            <w:r/>
-            <w:r>
-              <w:rPr>
-                <w:b w:val="0"/>
-                <w:sz w:val="17"/>
-              </w:rPr>
-              <w:t>Northshore</w:t>
-            </w:r>
-          </w:p>
-        </w:tc>
-        <w:tc>
-          <w:tcPr>
-            <w:tcW w:type="dxa" w:w="7200"/>
-            <w:shd w:val="clear" w:color="auto" w:fill="E9C46A"/>
-          </w:tcPr>
-          <w:p>
-            <w:pPr>
-              <w:jc w:val="left"/>
-            </w:pPr>
-            <w:r/>
-            <w:r>
-              <w:rPr>
-                <w:b w:val="0"/>
-                <w:sz w:val="17"/>
-              </w:rPr>
-              <w:t>Began assembling baskets of local products for her realtor husband's clients; now stocks 130+ TN makers and won a 2026 Shopify Milestone Award.</w:t>
-            </w:r>
-          </w:p>
-        </w:tc>
-        <w:tc>
-          <w:tcPr>
-            <w:tcW w:type="dxa" w:w="792"/>
-            <w:shd w:val="clear" w:color="auto" w:fill="E9C46A"/>
-          </w:tcPr>
-          <w:p>
-            <w:pPr>
-              <w:jc w:val="center"/>
-            </w:pPr>
-            <w:r/>
-            <w:r>
-              <w:rPr>
-                <w:b w:val="0"/>
-                <w:sz w:val="17"/>
-              </w:rPr>
-              <w:t>High</w:t>
-            </w:r>
-          </w:p>
-        </w:tc>
-      </w:tr>
-      <w:tr>
-        <w:tc>
-          <w:tcPr>
-            <w:tcW w:type="dxa" w:w="2160"/>
-            <w:shd w:val="clear" w:color="auto" w:fill="E9C46A"/>
-          </w:tcPr>
-          <w:p>
-            <w:pPr>
-              <w:jc w:val="left"/>
-            </w:pPr>
-            <w:r/>
-            <w:r>
-              <w:rPr>
-                <w:b/>
-                <w:color w:val="1B3A4B"/>
-                <w:sz w:val="17"/>
-              </w:rPr>
-              <w:t>Collier Construction  ★</w:t>
-            </w:r>
-          </w:p>
-        </w:tc>
-        <w:tc>
-          <w:tcPr>
-            <w:tcW w:type="dxa" w:w="2880"/>
-            <w:shd w:val="clear" w:color="auto" w:fill="E9C46A"/>
-          </w:tcPr>
-          <w:p>
-            <w:pPr>
-              <w:jc w:val="left"/>
-            </w:pPr>
-            <w:r/>
-            <w:r>
-              <w:rPr>
-                <w:b w:val="0"/>
-                <w:sz w:val="17"/>
-              </w:rPr>
-              <w:t>Ethan Collier — founder/CEO</w:t>
-            </w:r>
-          </w:p>
-        </w:tc>
-        <w:tc>
-          <w:tcPr>
-            <w:tcW w:type="dxa" w:w="1656"/>
-            <w:shd w:val="clear" w:color="auto" w:fill="E9C46A"/>
-          </w:tcPr>
-          <w:p>
-            <w:pPr>
-              <w:jc w:val="left"/>
-            </w:pPr>
-            <w:r/>
-            <w:r>
-              <w:rPr>
-                <w:b w:val="0"/>
-                <w:sz w:val="17"/>
-              </w:rPr>
-              <w:t>Chattanooga</w:t>
-            </w:r>
-          </w:p>
-        </w:tc>
-        <w:tc>
-          <w:tcPr>
-            <w:tcW w:type="dxa" w:w="7200"/>
-            <w:shd w:val="clear" w:color="auto" w:fill="E9C46A"/>
-          </w:tcPr>
-          <w:p>
-            <w:pPr>
-              <w:jc w:val="left"/>
-            </w:pPr>
-            <w:r/>
-            <w:r>
-              <w:rPr>
-                <w:b w:val="0"/>
-                <w:sz w:val="17"/>
-              </w:rPr>
-              <w:t>Grew up here; a LEED-accredited builder who pioneered green building and urban infill before it was fashionable, with multiple LEED Platinum projects.</w:t>
-            </w:r>
-          </w:p>
-        </w:tc>
-        <w:tc>
-          <w:tcPr>
-            <w:tcW w:type="dxa" w:w="792"/>
-            <w:shd w:val="clear" w:color="auto" w:fill="E9C46A"/>
-          </w:tcPr>
-          <w:p>
-            <w:pPr>
-              <w:jc w:val="center"/>
-            </w:pPr>
-            <w:r/>
-            <w:r>
-              <w:rPr>
-                <w:b w:val="0"/>
-                <w:sz w:val="17"/>
-              </w:rPr>
-              <w:t>High</w:t>
-            </w:r>
-          </w:p>
-        </w:tc>
-      </w:tr>
-      <w:tr>
-        <w:tc>
-          <w:tcPr>
-            <w:tcW w:type="dxa" w:w="2160"/>
-            <w:shd w:val="clear" w:color="auto" w:fill="E9C46A"/>
-          </w:tcPr>
-          <w:p>
-            <w:pPr>
-              <w:jc w:val="left"/>
-            </w:pPr>
-            <w:r/>
-            <w:r>
-              <w:rPr>
-                <w:b/>
-                <w:color w:val="1B3A4B"/>
-                <w:sz w:val="17"/>
-              </w:rPr>
-              <w:t>Boreal Woodworks  ★</w:t>
-            </w:r>
-          </w:p>
-        </w:tc>
-        <w:tc>
-          <w:tcPr>
-            <w:tcW w:type="dxa" w:w="2880"/>
-            <w:shd w:val="clear" w:color="auto" w:fill="E9C46A"/>
-          </w:tcPr>
-          <w:p>
-            <w:pPr>
-              <w:jc w:val="left"/>
-            </w:pPr>
-            <w:r/>
-            <w:r>
-              <w:rPr>
-                <w:b w:val="0"/>
-                <w:sz w:val="17"/>
-              </w:rPr>
-              <w:t>Nathan Kolb — founder (w/ Nate Penman)</w:t>
-            </w:r>
-          </w:p>
-        </w:tc>
-        <w:tc>
-          <w:tcPr>
-            <w:tcW w:type="dxa" w:w="1656"/>
-            <w:shd w:val="clear" w:color="auto" w:fill="E9C46A"/>
-          </w:tcPr>
-          <w:p>
-            <w:pPr>
-              <w:jc w:val="left"/>
-            </w:pPr>
-            <w:r/>
-            <w:r>
-              <w:rPr>
-                <w:b w:val="0"/>
-                <w:sz w:val="17"/>
-              </w:rPr>
-              <w:t>North Chattanooga</w:t>
-            </w:r>
-          </w:p>
-        </w:tc>
-        <w:tc>
-          <w:tcPr>
-            <w:tcW w:type="dxa" w:w="7200"/>
-            <w:shd w:val="clear" w:color="auto" w:fill="E9C46A"/>
-          </w:tcPr>
-          <w:p>
-            <w:pPr>
-              <w:jc w:val="left"/>
-            </w:pPr>
-            <w:r/>
-            <w:r>
-              <w:rPr>
-                <w:b w:val="0"/>
-                <w:sz w:val="17"/>
-              </w:rPr>
-              <w:t>Chattanooga Woodworking Academy grad who apprenticed under a master; builds heirloom furniture from Appalachian hardwoods (TFP profile, 2026).</w:t>
-            </w:r>
-          </w:p>
-        </w:tc>
-        <w:tc>
-          <w:tcPr>
-            <w:tcW w:type="dxa" w:w="792"/>
-            <w:shd w:val="clear" w:color="auto" w:fill="E9C46A"/>
-          </w:tcPr>
-          <w:p>
-            <w:pPr>
-              <w:jc w:val="center"/>
-            </w:pPr>
-            <w:r/>
-            <w:r>
-              <w:rPr>
-                <w:b w:val="0"/>
-                <w:sz w:val="17"/>
-              </w:rPr>
-              <w:t>High</w:t>
-            </w:r>
-          </w:p>
-        </w:tc>
-      </w:tr>
-      <w:tr>
-        <w:tc>
-          <w:tcPr>
-            <w:tcW w:type="dxa" w:w="2160"/>
-            <w:shd w:val="clear" w:color="auto" w:fill="E9C46A"/>
-          </w:tcPr>
-          <w:p>
-            <w:pPr>
-              <w:jc w:val="left"/>
-            </w:pPr>
-            <w:r/>
-            <w:r>
-              <w:rPr>
-                <w:b/>
-                <w:color w:val="1B3A4B"/>
-                <w:sz w:val="17"/>
-              </w:rPr>
-              <w:t>Sequatchie Cove Farm  ★</w:t>
-            </w:r>
-          </w:p>
-        </w:tc>
-        <w:tc>
-          <w:tcPr>
-            <w:tcW w:type="dxa" w:w="2880"/>
-            <w:shd w:val="clear" w:color="auto" w:fill="E9C46A"/>
-          </w:tcPr>
-          <w:p>
-            <w:pPr>
-              <w:jc w:val="left"/>
-            </w:pPr>
-            <w:r/>
-            <w:r>
-              <w:rPr>
-                <w:b w:val="0"/>
-                <w:sz w:val="17"/>
-              </w:rPr>
-              <w:t>The Keener family (Bill &amp; Miriam; Kelsey &amp; Ashley)</w:t>
-            </w:r>
-          </w:p>
-        </w:tc>
-        <w:tc>
-          <w:tcPr>
-            <w:tcW w:type="dxa" w:w="1656"/>
-            <w:shd w:val="clear" w:color="auto" w:fill="E9C46A"/>
-          </w:tcPr>
-          <w:p>
-            <w:pPr>
-              <w:jc w:val="left"/>
-            </w:pPr>
-            <w:r/>
-            <w:r>
-              <w:rPr>
-                <w:b w:val="0"/>
-                <w:sz w:val="17"/>
-              </w:rPr>
-              <w:t>Sequatchie Cove (Marion Co.)</w:t>
-            </w:r>
-          </w:p>
-        </w:tc>
-        <w:tc>
-          <w:tcPr>
-            <w:tcW w:type="dxa" w:w="7200"/>
-            <w:shd w:val="clear" w:color="auto" w:fill="E9C46A"/>
-          </w:tcPr>
-          <w:p>
-            <w:pPr>
-              <w:jc w:val="left"/>
-            </w:pPr>
-            <w:r/>
-            <w:r>
-              <w:rPr>
-                <w:b w:val="0"/>
-                <w:sz w:val="17"/>
-              </w:rPr>
-              <w:t>Four generations on 300 regenerative acres; the creamery's raw-milk 'Dancing Fern' is a nationally recognized Tennessee farmstead cheese.</w:t>
-            </w:r>
-          </w:p>
-        </w:tc>
-        <w:tc>
-          <w:tcPr>
-            <w:tcW w:type="dxa" w:w="792"/>
-            <w:shd w:val="clear" w:color="auto" w:fill="E9C46A"/>
-          </w:tcPr>
-          <w:p>
-            <w:pPr>
-              <w:jc w:val="center"/>
-            </w:pPr>
-            <w:r/>
-            <w:r>
-              <w:rPr>
-                <w:b w:val="0"/>
-                <w:sz w:val="17"/>
-              </w:rPr>
-              <w:t>High</w:t>
-            </w:r>
-          </w:p>
-        </w:tc>
-      </w:tr>
-      <w:tr>
-        <w:tc>
-          <w:tcPr>
-            <w:tcW w:type="dxa" w:w="2160"/>
-            <w:shd w:val="clear" w:color="auto" w:fill="E9C46A"/>
-          </w:tcPr>
-          <w:p>
-            <w:pPr>
-              <w:jc w:val="left"/>
-            </w:pPr>
-            <w:r/>
-            <w:r>
-              <w:rPr>
-                <w:b/>
-                <w:color w:val="1B3A4B"/>
-                <w:sz w:val="17"/>
-              </w:rPr>
-              <w:t>Synergy Climbing and Ninja  ★</w:t>
-            </w:r>
-          </w:p>
-        </w:tc>
-        <w:tc>
-          <w:tcPr>
-            <w:tcW w:type="dxa" w:w="2880"/>
-            <w:shd w:val="clear" w:color="auto" w:fill="E9C46A"/>
-          </w:tcPr>
-          <w:p>
-            <w:pPr>
-              <w:jc w:val="left"/>
-            </w:pPr>
-            <w:r/>
-            <w:r>
-              <w:rPr>
-                <w:b w:val="0"/>
-                <w:sz w:val="17"/>
-              </w:rPr>
-              <w:t>Lisa Rands &amp; Isaac Caldiero — co-founders</w:t>
-            </w:r>
-          </w:p>
-        </w:tc>
-        <w:tc>
-          <w:tcPr>
-            <w:tcW w:type="dxa" w:w="1656"/>
-            <w:shd w:val="clear" w:color="auto" w:fill="E9C46A"/>
-          </w:tcPr>
-          <w:p>
-            <w:pPr>
-              <w:jc w:val="left"/>
-            </w:pPr>
-            <w:r/>
-            <w:r>
-              <w:rPr>
-                <w:b w:val="0"/>
-                <w:sz w:val="17"/>
-              </w:rPr>
-              <w:t>Southside (E. Main)</w:t>
-            </w:r>
-          </w:p>
-        </w:tc>
-        <w:tc>
-          <w:tcPr>
-            <w:tcW w:type="dxa" w:w="7200"/>
-            <w:shd w:val="clear" w:color="auto" w:fill="E9C46A"/>
-          </w:tcPr>
-          <w:p>
-            <w:pPr>
-              <w:jc w:val="left"/>
-            </w:pPr>
-            <w:r/>
-            <w:r>
-              <w:rPr>
-                <w:b w:val="0"/>
-                <w:sz w:val="17"/>
-              </w:rPr>
-              <w:t>A world-champion boulderer and the first million-dollar 'American Ninja Warrior' winner built a community gym in their adopted hometown.</w:t>
-            </w:r>
-          </w:p>
-        </w:tc>
-        <w:tc>
-          <w:tcPr>
-            <w:tcW w:type="dxa" w:w="792"/>
-            <w:shd w:val="clear" w:color="auto" w:fill="E9C46A"/>
-          </w:tcPr>
-          <w:p>
-            <w:pPr>
-              <w:jc w:val="center"/>
-            </w:pPr>
-            <w:r/>
-            <w:r>
-              <w:rPr>
-                <w:b w:val="0"/>
-                <w:sz w:val="17"/>
-              </w:rPr>
-              <w:t>High</w:t>
-            </w:r>
-          </w:p>
-        </w:tc>
-      </w:tr>
-      <w:tr>
-        <w:tc>
-          <w:tcPr>
-            <w:tcW w:type="dxa" w:w="2160"/>
-            <w:shd w:val="clear" w:color="auto" w:fill="E9C46A"/>
-          </w:tcPr>
-          <w:p>
-            <w:pPr>
-              <w:jc w:val="left"/>
-            </w:pPr>
-            <w:r/>
-            <w:r>
-              <w:rPr>
-                <w:b/>
-                <w:color w:val="1B3A4B"/>
-                <w:sz w:val="17"/>
-              </w:rPr>
-              <w:t>Two Bikes Chattanooga  ★</w:t>
-            </w:r>
-          </w:p>
-        </w:tc>
-        <w:tc>
-          <w:tcPr>
-            <w:tcW w:type="dxa" w:w="2880"/>
-            <w:shd w:val="clear" w:color="auto" w:fill="E9C46A"/>
-          </w:tcPr>
-          <w:p>
-            <w:pPr>
-              <w:jc w:val="left"/>
-            </w:pPr>
-            <w:r/>
-            <w:r>
-              <w:rPr>
-                <w:b w:val="0"/>
-                <w:sz w:val="17"/>
-              </w:rPr>
-              <w:t>Mitchell Connell — founder/ED</w:t>
-            </w:r>
-          </w:p>
-        </w:tc>
-        <w:tc>
-          <w:tcPr>
-            <w:tcW w:type="dxa" w:w="1656"/>
-            <w:shd w:val="clear" w:color="auto" w:fill="E9C46A"/>
-          </w:tcPr>
-          <w:p>
-            <w:pPr>
-              <w:jc w:val="left"/>
-            </w:pPr>
-            <w:r/>
-            <w:r>
-              <w:rPr>
-                <w:b w:val="0"/>
-                <w:sz w:val="17"/>
-              </w:rPr>
-              <w:t>Chattanooga</w:t>
-            </w:r>
-          </w:p>
-        </w:tc>
-        <w:tc>
-          <w:tcPr>
-            <w:tcW w:type="dxa" w:w="7200"/>
-            <w:shd w:val="clear" w:color="auto" w:fill="E9C46A"/>
-          </w:tcPr>
-          <w:p>
-            <w:pPr>
-              <w:jc w:val="left"/>
-            </w:pPr>
-            <w:r/>
-            <w:r>
-              <w:rPr>
-                <w:b w:val="0"/>
-                <w:sz w:val="17"/>
-              </w:rPr>
-              <w:t>A nonprofit bike shop that donates a bike for every one sold and runs paid internships for at-risk youth — retail meets mission.</w:t>
-            </w:r>
-          </w:p>
-        </w:tc>
-        <w:tc>
-          <w:tcPr>
-            <w:tcW w:type="dxa" w:w="792"/>
-            <w:shd w:val="clear" w:color="auto" w:fill="E9C46A"/>
-          </w:tcPr>
-          <w:p>
-            <w:pPr>
-              <w:jc w:val="center"/>
-            </w:pPr>
-            <w:r/>
-            <w:r>
-              <w:rPr>
-                <w:b w:val="0"/>
-                <w:sz w:val="17"/>
-              </w:rPr>
-              <w:t>High</w:t>
-            </w:r>
-          </w:p>
-        </w:tc>
-      </w:tr>
-    </w:tbl>
     <w:p>
       <w:pPr>
+        <w:pStyle w:val="ListBullet"/>
         <w:spacing w:after="40"/>
       </w:pPr>
+      <w:r>
+        <w:rPr>
+          <w:sz w:val="19"/>
+        </w:rPr>
+        <w:t>Calliope — Khaled Albanna — chef &amp; co-owner  ·  Restaurants &amp; Chef-Owners</w:t>
+      </w:r>
+    </w:p>
+    <w:p>
+      <w:pPr>
+        <w:pStyle w:val="ListBullet"/>
+        <w:spacing w:after="40"/>
+      </w:pPr>
+      <w:r>
+        <w:rPr>
+          <w:sz w:val="19"/>
+        </w:rPr>
+        <w:t>Alleia — Daniel Lindley — chef-owner  ·  Restaurants &amp; Chef-Owners</w:t>
+      </w:r>
+    </w:p>
+    <w:p>
+      <w:pPr>
+        <w:pStyle w:val="ListBullet"/>
+        <w:spacing w:after="40"/>
+      </w:pPr>
+      <w:r>
+        <w:rPr>
+          <w:sz w:val="19"/>
+        </w:rPr>
+        <w:t>Chattanooga Whiskey — Tim Piersant — co-founder/CEO (w/ Joe Ledbetter)  ·  Bars, Breweries &amp; Distilleries</w:t>
+      </w:r>
+    </w:p>
+    <w:p>
+      <w:pPr>
+        <w:pStyle w:val="ListBullet"/>
+        <w:spacing w:after="40"/>
+      </w:pPr>
+      <w:r>
+        <w:rPr>
+          <w:sz w:val="19"/>
+        </w:rPr>
+        <w:t>Mad Priest Coffee — Michael &amp; Cherita Rice — co-founders  ·  Coffee, Bakeries &amp; Food Makers</w:t>
+      </w:r>
+    </w:p>
+    <w:p>
+      <w:pPr>
+        <w:pStyle w:val="ListBullet"/>
+        <w:spacing w:after="40"/>
+      </w:pPr>
+      <w:r>
+        <w:rPr>
+          <w:sz w:val="19"/>
+        </w:rPr>
+        <w:t>Niedlov's Bakery &amp; Café — Erik &amp; Lauren Zilen — owners  ·  Coffee, Bakeries &amp; Food Makers</w:t>
+      </w:r>
+    </w:p>
+    <w:p>
+      <w:pPr>
+        <w:pStyle w:val="ListBullet"/>
+        <w:spacing w:after="40"/>
+      </w:pPr>
+      <w:r>
+        <w:rPr>
+          <w:sz w:val="19"/>
+        </w:rPr>
+        <w:t>Cocoa Asante — Ella Livingston — founder  ·  Coffee, Bakeries &amp; Food Makers</w:t>
+      </w:r>
+    </w:p>
+    <w:p>
+      <w:pPr>
+        <w:pStyle w:val="ListBullet"/>
+        <w:spacing w:after="40"/>
+      </w:pPr>
+      <w:r>
+        <w:rPr>
+          <w:sz w:val="19"/>
+        </w:rPr>
+        <w:t>Embellish Collection — Ann Trammell Newton — owner  ·  Retail, Boutiques &amp; Creative Services</w:t>
+      </w:r>
+    </w:p>
+    <w:p>
+      <w:pPr>
+        <w:pStyle w:val="ListBullet"/>
+        <w:spacing w:after="40"/>
+      </w:pPr>
+      <w:r>
+        <w:rPr>
+          <w:sz w:val="19"/>
+        </w:rPr>
+        <w:t>Locals Only Gifts &amp; Goods — Danielle Landrum — founder (w/ Eric)  ·  Retail, Boutiques &amp; Creative Services</w:t>
+      </w:r>
+    </w:p>
+    <w:p>
+      <w:pPr>
+        <w:pStyle w:val="ListBullet"/>
+        <w:spacing w:after="40"/>
+      </w:pPr>
+      <w:r>
+        <w:rPr>
+          <w:sz w:val="19"/>
+        </w:rPr>
+        <w:t>Collier Construction — Ethan Collier — founder/CEO  ·  Home Builders, Makers &amp; Craftspeople</w:t>
+      </w:r>
+    </w:p>
+    <w:p>
+      <w:pPr>
+        <w:pStyle w:val="ListBullet"/>
+        <w:spacing w:after="40"/>
+      </w:pPr>
+      <w:r>
+        <w:rPr>
+          <w:sz w:val="19"/>
+        </w:rPr>
+        <w:t>Boreal Woodworks — Nathan Kolb — founder (w/ Nate Penman)  ·  Home Builders, Makers &amp; Craftspeople</w:t>
+      </w:r>
+    </w:p>
+    <w:p>
+      <w:pPr>
+        <w:pStyle w:val="ListBullet"/>
+        <w:spacing w:after="40"/>
+      </w:pPr>
+      <w:r>
+        <w:rPr>
+          <w:sz w:val="19"/>
+        </w:rPr>
+        <w:t>Sequatchie Cove Farm — The Keener family (Bill &amp; Miriam; Kelsey &amp; Ashley)  ·  Farms &amp; Farmers</w:t>
+      </w:r>
+    </w:p>
+    <w:p>
+      <w:pPr>
+        <w:pStyle w:val="ListBullet"/>
+        <w:spacing w:after="40"/>
+      </w:pPr>
+      <w:r>
+        <w:rPr>
+          <w:sz w:val="19"/>
+        </w:rPr>
+        <w:t>Synergy Climbing and Ninja — Lisa Rands &amp; Isaac Caldiero — co-founders  ·  Outdoor, Adventure &amp; Founders</w:t>
+      </w:r>
+    </w:p>
+    <w:p>
+      <w:pPr>
+        <w:pStyle w:val="ListBullet"/>
+        <w:spacing w:after="40"/>
+      </w:pPr>
+      <w:r>
+        <w:rPr>
+          <w:sz w:val="19"/>
+        </w:rPr>
+        <w:t>Two Bikes Chattanooga — Mitchell Connell — founder/ED  ·  Outdoor, Adventure &amp; Founders</w:t>
+      </w:r>
     </w:p>
     <w:p>
       <w:pPr>

</xml_diff>